<commit_message>
Lead section 3.4 with plain arithmetic, demote the ANOVA to支持 evidence
분산분해 수치를 앞세우던 3.4절을 단순 산수 우선 구조로 재배열했다.
결론과 수치는 동일하고 제시 순서만 바뀌었다.

Reorders section 3.4 to put the plain arithmetic first and the variance
decomposition last. The conclusion and the numbers are unchanged; only
the order of presentation differs.

새 순서:
1. alpha별 압축 페널티를 그대로 나열 (4bit 5.66/5.57/5.94/5.79%,
   변동폭 0.37%p) + Figure 3
2. 그 변동폭이 의미 있는지 판단할 노이즈 기준을 8bit에서 얻음
   (성능이 무손실인 조건인데도 -0.56%~+1.02%로 흩어짐) + 방향이
   가설과 반대(최대 간격이 alpha=100)
3. 양 끝점 대비로 크기 상한 제시 (-0.0012, 95% CI +/-0.019)
4. 분산분해는 마지막에 한 문단으로 축약 (압축 89.6% vs 상호작용 0.2%,
   F=0.15), 상세 표는 부록 A2a 참조

이렇게 하면 통계 배경이 없는 독자도 1~3만 읽고 결론에 도달할 수 있고,
요인설계의 표준 분석을 생략했다는 지적도 피할 수 있다.

Co-Authored-By: Claude Opus 5 <noreply@anthropic.com>
</commit_message>
<xml_diff>
--- a/reports/Week6_Results_Discussion_draft.docx
+++ b/reports/Week6_Results_Discussion_draft.docx
@@ -129,7 +129,7 @@
           <w:b w:val="0"/>
           <w:sz w:val="24"/>
         </w:rPr>
-        <w:t>The interaction that motivated the study was not observed. In the decomposition of final-round loss the compression-by-alpha term accounted for 0.2% of total variance with F = 0.15 (p = 0.98); an F ratio below one means the variation attributed to the interaction was smaller than the residual variation (Table A2a). The same conclusion follows directly from the penalties themselves: the 4-bit perplexity cost was 5.66%, 5.57%, 5.94% and 5.79% at alpha = 0.1, 1, 10 and 100 respectively, and the 8-bit cost 0.72%, 0.19%, 0.54% and 0.73% (Table A5). Graphically, the vertical separation between compression levels in Figure 3 is constant across three orders of magnitude of alpha. The same term was not significant for ROUGE-L (F = 1.61, p = 0.29; Table A2c).</w:t>
+        <w:t>The interaction that motivated the study was not observed. The simplest way to see this is to read the compression penalty off each heterogeneity setting in turn. Relative to the uncompressed baseline, QLoRA 4-bit cost 5.66%, 5.57%, 5.94% and 5.79% in perplexity at alpha = 0.1, 1, 10 and 100 respectively - a spread of 0.37 percentage points across a thousand-fold change in heterogeneity. The corresponding 8-bit figures were 0.72%, 0.19%, 0.54% and 0.73% (Table A5). Figure 3 shows the same thing graphically: the vertical separation between compression levels does not widen as the data become more heterogeneous.</w:t>
       </w:r>
     </w:p>
     <w:p>
@@ -139,7 +139,27 @@
           <w:b w:val="0"/>
           <w:sz w:val="24"/>
         </w:rPr>
-        <w:t>Because a null result is only informative if its precision is known, the interaction was also bounded. Contrasting the 4-bit penalty at alpha = 0.1 against alpha = 100 and averaging over both aggregation rules gives a difference of -0.0012 in loss with an approximate 95% confidence interval of +/-0.019, equivalent to roughly +/-2 percentage points of perplexity. Effects of the size that motivated the hypothesis - for instance a doubling of the quantisation penalty under strong heterogeneity - are therefore excluded by these data, even though small effects cannot be ruled out.</w:t>
+        <w:t>Whether a spread of 0.37 percentage points is meaningful depends on how much these runs vary for reasons unrelated to the experiment, and the 8-bit condition provides an estimate of exactly that. Its quality is indistinguishable from the uncompressed baseline (Section 3.2), so scatter in its penalty is measurement variability rather than a real effect; across the eight cells that penalty ranged from -0.56% to +1.02%. The variation attributable to heterogeneity is thus smaller than the variation seen in a condition where no effect exists. The direction is wrong for the hypothesis as well: the widest 4-bit gap occurred at alpha = 100, the most uniform setting, rather than at alpha = 0.1.</w:t>
+      </w:r>
+    </w:p>
+    <w:p>
+      <w:r>
+        <w:rPr>
+          <w:rFonts w:ascii="Times New Roman" w:hAnsi="Times New Roman"/>
+          <w:b w:val="0"/>
+          <w:sz w:val="24"/>
+        </w:rPr>
+        <w:t>A null result is only informative if its precision is known, so the interaction was also bounded directly. Contrasting the 4-bit penalty at alpha = 0.1 against alpha = 100, averaged over both aggregation rules, gives a difference of -0.0012 in validation loss with an approximate 95% confidence interval of +/-0.019, equivalent to roughly +/-2 percentage points of perplexity. An effect of the size the hypothesis implied - a doubling of the quantisation penalty under strong heterogeneity, say - is therefore excluded by these data, although small effects cannot be ruled out.</w:t>
+      </w:r>
+    </w:p>
+    <w:p>
+      <w:r>
+        <w:rPr>
+          <w:rFonts w:ascii="Times New Roman" w:hAnsi="Times New Roman"/>
+          <w:b w:val="0"/>
+          <w:sz w:val="24"/>
+        </w:rPr>
+        <w:t>A three-way variance decomposition of the same measurements agrees, and places the effect in context: compression accounts for 89.6% of the variance in final validation loss, whereas the compression-by-heterogeneity interaction accounts for 0.2% with an F ratio of 0.15, meaning the variation attributed to it is smaller than the residual variation (Table A2a). The interaction is likewise not significant for ROUGE-L (Table A2c).</w:t>
       </w:r>
     </w:p>
     <w:p>

</xml_diff>